<commit_message>
Update Lab01 presentation and teaching guides; preserve student TODOs
</commit_message>
<xml_diff>
--- a/Huong_dan.docx
+++ b/Huong_dan.docx
@@ -270,7 +270,7 @@
         </w:rPr>
         <w:drawing>
           <wp:inline xmlns:a="http://schemas.openxmlformats.org/drawingml/2006/main" xmlns:pic="http://schemas.openxmlformats.org/drawingml/2006/picture">
-            <wp:extent cx="5580000" cy="3195818"/>
+            <wp:extent cx="5580000" cy="3487500"/>
             <wp:docPr id="1" name="Picture 1" descr="Trang CommunityPass khi mã PHP đã chạy trên máy thực hành."/>
             <wp:cNvGraphicFramePr>
               <a:graphicFrameLocks noChangeAspect="1"/>
@@ -291,7 +291,7 @@
                   <pic:spPr>
                     <a:xfrm>
                       <a:off x="0" y="0"/>
-                      <a:ext cx="5580000" cy="3195818"/>
+                      <a:ext cx="5580000" cy="3487500"/>
                     </a:xfrm>
                     <a:prstGeom prst="rect"/>
                   </pic:spPr>
@@ -330,6 +330,12 @@
           <w:sz w:val="26"/>
         </w:rPr>
         <w:t>Kết quả mẫu: trình duyệt hiển thị CommunityPass và dòng “Mã nguồn PHP đã chạy trên máy của bạn”.</w:t>
+      </w:r>
+    </w:p>
+    <w:p>
+      <w:pPr/>
+      <w:r>
+        <w:t>Giao diện Material 3 dùng public/assets/css/tokens.css và app.css trong chính lab. Trang Web vẫn chỉ kiểm tra môi trường; phần shell và bài tự làm giữ nguyên.</w:t>
       </w:r>
     </w:p>
     <w:p>

</xml_diff>